<commit_message>
Add product list search/pagination and automatic DB migration + seeding
Product list now supports a live search box (name/SKU) and pagination
(10-100 rows per page, Prev/Next, clickable page numbers with ellipsis
for large page counts), shown only when there's more than one page.

The API now auto-applies pending EF Core migrations and seeds 20 sample
products (pharmacy/retail/coffee-shop) on startup in Development, only
when the Products table is empty - so cloning the repo and running the
API is enough to get a populated local database, no manual dotnet ef
commands required. Seeding goes through ProductService.CreateAsync so
seeded products get proper InitialStock movements like real ones.

Co-Authored-By: Claude Sonnet 5 <noreply@anthropic.com>
</commit_message>
<xml_diff>
--- a/docs/exports/CONTRIBUTING.docx
+++ b/docs/exports/CONTRIBUTING.docx
@@ -1382,62 +1382,7 @@
       </w:pPr>
       <w:r>
         <w:rPr/>
-        <w:t>Step 2 — Apply migrations</w:t>
-      </w:r>
-    </w:p>
-    <w:p>
-      <w:pPr>
-        <w:pStyle w:val="BodyText"/>
-        <w:bidi w:val="0"/>
-        <w:spacing w:lineRule="auto" w:line="276" w:before="160" w:after="160"/>
-        <w:ind w:left="160" w:right="160"/>
-        <w:jc w:val="left"/>
-        <w:rPr/>
-      </w:pPr>
-      <w:r>
-        <w:rPr/>
-        <w:t xml:space="preserve">From </w:t>
-      </w:r>
-      <w:r>
-        <w:rPr>
-          <w:rStyle w:val="SourceText"/>
-        </w:rPr>
-        <w:t>src/server/Vendora.Api</w:t>
-      </w:r>
-      <w:r>
-        <w:rPr/>
-        <w:t>:</w:t>
-      </w:r>
-    </w:p>
-    <w:p>
-      <w:pPr>
-        <w:pStyle w:val="PreformattedText"/>
-        <w:bidi w:val="0"/>
-        <w:spacing w:before="1134" w:after="283"/>
-        <w:jc w:val="left"/>
-        <w:rPr/>
-      </w:pPr>
-      <w:r>
-        <w:rPr/>
-        <w:t>dotnet ef database update --project ../Vendora.Infrastructure --startup-project .</w:t>
-      </w:r>
-    </w:p>
-    <w:p>
-      <w:pPr>
-        <w:pStyle w:val="Heading3"/>
-        <w:numPr>
-          <w:ilvl w:val="0"/>
-          <w:numId w:val="0"/>
-        </w:numPr>
-        <w:bidi w:val="0"/>
-        <w:spacing w:before="320" w:after="120"/>
-        <w:ind w:left="1134"/>
-        <w:jc w:val="left"/>
-        <w:rPr/>
-      </w:pPr>
-      <w:r>
-        <w:rPr/>
-        <w:t>Step 3 — Run the API</w:t>
+        <w:t>Step 2 — Run the API (no manual migration step needed)</w:t>
       </w:r>
     </w:p>
     <w:p>
@@ -1483,60 +1428,27 @@
       </w:pPr>
       <w:r>
         <w:rPr/>
-        <w:t xml:space="preserve">This frees ports 7196/5136 first, so re-running is always safe. It's a bash script — works as-is in a Linux/macOS terminal, or in </w:t>
-      </w:r>
-      <w:r>
-        <w:rPr>
-          <w:b/>
-        </w:rPr>
-        <w:t>Git Bash</w:t>
-      </w:r>
-      <w:r>
-        <w:rPr/>
-        <w:t xml:space="preserve"> or </w:t>
-      </w:r>
-      <w:r>
-        <w:rPr>
-          <w:b/>
-        </w:rPr>
-        <w:t>WSL2</w:t>
-      </w:r>
-      <w:r>
-        <w:rPr/>
-        <w:t xml:space="preserve"> on Windows. If you're in native PowerShell/CMD, just run </w:t>
-      </w:r>
-      <w:r>
-        <w:rPr>
-          <w:rStyle w:val="SourceText"/>
-        </w:rPr>
-        <w:t>dotnet run --launch-profile https</w:t>
-      </w:r>
-      <w:r>
-        <w:rPr/>
-        <w:t xml:space="preserve"> directly instead (from </w:t>
-      </w:r>
-      <w:r>
-        <w:rPr>
-          <w:rStyle w:val="SourceText"/>
-        </w:rPr>
-        <w:t>src/server/Vendora.Api</w:t>
-      </w:r>
-      <w:r>
-        <w:rPr/>
-        <w:t>); if you hit a "port already in use" error, find and stop the process with:</w:t>
-      </w:r>
-    </w:p>
-    <w:p>
-      <w:pPr>
-        <w:pStyle w:val="PreformattedText"/>
-        <w:bidi w:val="0"/>
-        <w:spacing w:before="1134" w:after="283"/>
-        <w:jc w:val="left"/>
-        <w:rPr/>
-      </w:pPr>
-      <w:r>
-        <w:rPr/>
-        <w:t>Get-Process -Id (Get-NetTCPConnection -LocalPort 7196).OwningProcess | Stop-Process</w:t>
+        <w:t xml:space="preserve">On startup, in the Development environment, the API automatically applies any pending EF Core migrations (creating the database schema from nothing, if needed) and then seeds 20 sample products (spanning pharmacy/retail/coffee-shop, matching the generic data model) — but only if the Products table is completely empty, so it never touches or duplicates data on a database you've already been working in. See </w:t>
+      </w:r>
+      <w:r>
+        <w:rPr>
+          <w:rStyle w:val="SourceText"/>
+        </w:rPr>
+        <w:t>Program.cs</w:t>
+      </w:r>
+      <w:r>
+        <w:rPr/>
+        <w:t xml:space="preserve"> and </w:t>
+      </w:r>
+      <w:r>
+        <w:rPr>
+          <w:rStyle w:val="SourceText"/>
+        </w:rPr>
+        <w:t>Vendora.Infrastructure/Persistence/DbSeeder.cs</w:t>
+      </w:r>
+      <w:r>
+        <w:rPr/>
+        <w:t>.</w:t>
       </w:r>
     </w:p>
     <w:p>
@@ -1549,6 +1461,79 @@
         <w:rPr/>
       </w:pPr>
       <w:r>
+        <w:rPr>
+          <w:rStyle w:val="SourceText"/>
+        </w:rPr>
+        <w:t>./scripts/run-api.sh</w:t>
+      </w:r>
+      <w:r>
+        <w:rPr/>
+        <w:t xml:space="preserve"> frees ports 7196/5136 first, so re-running is always safe. It's a bash script — works as-is in a Linux/macOS terminal, or in </w:t>
+      </w:r>
+      <w:r>
+        <w:rPr>
+          <w:b/>
+        </w:rPr>
+        <w:t>Git Bash</w:t>
+      </w:r>
+      <w:r>
+        <w:rPr/>
+        <w:t xml:space="preserve"> or </w:t>
+      </w:r>
+      <w:r>
+        <w:rPr>
+          <w:b/>
+        </w:rPr>
+        <w:t>WSL2</w:t>
+      </w:r>
+      <w:r>
+        <w:rPr/>
+        <w:t xml:space="preserve"> on Windows. If you're in native PowerShell/CMD, just run </w:t>
+      </w:r>
+      <w:r>
+        <w:rPr>
+          <w:rStyle w:val="SourceText"/>
+        </w:rPr>
+        <w:t>dotnet run --launch-profile https</w:t>
+      </w:r>
+      <w:r>
+        <w:rPr/>
+        <w:t xml:space="preserve"> directly instead (from </w:t>
+      </w:r>
+      <w:r>
+        <w:rPr>
+          <w:rStyle w:val="SourceText"/>
+        </w:rPr>
+        <w:t>src/server/Vendora.Api</w:t>
+      </w:r>
+      <w:r>
+        <w:rPr/>
+        <w:t>); if you hit a "port already in use" error, find and stop the process with:</w:t>
+      </w:r>
+    </w:p>
+    <w:p>
+      <w:pPr>
+        <w:pStyle w:val="PreformattedText"/>
+        <w:bidi w:val="0"/>
+        <w:spacing w:before="1134" w:after="283"/>
+        <w:jc w:val="left"/>
+        <w:rPr/>
+      </w:pPr>
+      <w:r>
+        <w:rPr/>
+        <w:t>Get-Process -Id (Get-NetTCPConnection -LocalPort 7196).OwningProcess | Stop-Process</w:t>
+      </w:r>
+    </w:p>
+    <w:p>
+      <w:pPr>
+        <w:pStyle w:val="BodyText"/>
+        <w:bidi w:val="0"/>
+        <w:spacing w:lineRule="auto" w:line="276" w:before="160" w:after="160"/>
+        <w:ind w:left="160" w:right="160"/>
+        <w:jc w:val="left"/>
+        <w:rPr/>
+      </w:pPr>
+      <w:r>
         <w:rPr/>
         <w:t xml:space="preserve">Either way, you must pass </w:t>
       </w:r>
@@ -1561,6 +1546,43 @@
       <w:r>
         <w:rPr/>
         <w:t xml:space="preserve"> when running manually, or the Angular proxy won't be able to reach the API — see the README.</w:t>
+      </w:r>
+    </w:p>
+    <w:p>
+      <w:pPr>
+        <w:pStyle w:val="BodyText"/>
+        <w:bidi w:val="0"/>
+        <w:spacing w:lineRule="auto" w:line="276" w:before="160" w:after="160"/>
+        <w:ind w:left="160" w:right="160"/>
+        <w:jc w:val="left"/>
+        <w:rPr/>
+      </w:pPr>
+      <w:r>
+        <w:rPr/>
+        <w:t xml:space="preserve">If you ever need to run migrations manually instead (e.g. against a database the API isn't pointed at), from </w:t>
+      </w:r>
+      <w:r>
+        <w:rPr>
+          <w:rStyle w:val="SourceText"/>
+        </w:rPr>
+        <w:t>src/server/Vendora.Api</w:t>
+      </w:r>
+      <w:r>
+        <w:rPr/>
+        <w:t>:</w:t>
+      </w:r>
+    </w:p>
+    <w:p>
+      <w:pPr>
+        <w:pStyle w:val="PreformattedText"/>
+        <w:bidi w:val="0"/>
+        <w:spacing w:before="1134" w:after="283"/>
+        <w:jc w:val="left"/>
+        <w:rPr/>
+      </w:pPr>
+      <w:r>
+        <w:rPr/>
+        <w:t>dotnet ef database update --project ../Vendora.Infrastructure --startup-project .</w:t>
       </w:r>
     </w:p>
     <w:p>
@@ -1578,7 +1600,7 @@
       </w:pPr>
       <w:r>
         <w:rPr/>
-        <w:t>Step 4 — Run the client</w:t>
+        <w:t>Step 3 — Run the client</w:t>
       </w:r>
     </w:p>
     <w:p>

</xml_diff>

<commit_message>
Crated checkout feature with mobile friendly UI. Sale can now void and undo same in single product in transaction.
</commit_message>
<xml_diff>
--- a/docs/exports/CONTRIBUTING.docx
+++ b/docs/exports/CONTRIBUTING.docx
@@ -1690,7 +1690,57 @@
       </w:r>
       <w:r>
         <w:rPr/>
-        <w:t xml:space="preserve"> to the API.</w:t>
+        <w:t xml:space="preserve"> and </w:t>
+      </w:r>
+      <w:r>
+        <w:rPr>
+          <w:rStyle w:val="SourceText"/>
+        </w:rPr>
+        <w:t>/uploads/*</w:t>
+      </w:r>
+      <w:r>
+        <w:rPr/>
+        <w:t xml:space="preserve"> to the API (see </w:t>
+      </w:r>
+      <w:r>
+        <w:rPr>
+          <w:rStyle w:val="SourceText"/>
+        </w:rPr>
+        <w:t>proxy.conf.json</w:t>
+      </w:r>
+      <w:r>
+        <w:rPr/>
+        <w:t xml:space="preserve">). </w:t>
+      </w:r>
+      <w:r>
+        <w:rPr>
+          <w:b/>
+        </w:rPr>
+        <w:t xml:space="preserve">If you edit </w:t>
+      </w:r>
+      <w:r>
+        <w:rPr>
+          <w:rStyle w:val="SourceText"/>
+          <w:b/>
+        </w:rPr>
+        <w:t>proxy.conf.json</w:t>
+      </w:r>
+      <w:r>
+        <w:rPr>
+          <w:b/>
+        </w:rPr>
+        <w:t xml:space="preserve">, stop and re-run </w:t>
+      </w:r>
+      <w:r>
+        <w:rPr>
+          <w:rStyle w:val="SourceText"/>
+          <w:b/>
+        </w:rPr>
+        <w:t>npm start</w:t>
+      </w:r>
+      <w:r>
+        <w:rPr/>
+        <w:t xml:space="preserve"> — Angular's dev server only reads that file once at startup, so a running instance won't pick up new proxy rules until it's restarted.</w:t>
       </w:r>
     </w:p>
     <w:p>
@@ -2353,6 +2403,7 @@
           <w:tab w:val="left" w:pos="869" w:leader="none"/>
         </w:tabs>
         <w:bidi w:val="0"/>
+        <w:spacing w:before="160" w:after="0"/>
         <w:ind w:hanging="283" w:left="869"/>
         <w:jc w:val="left"/>
         <w:rPr/>
@@ -2410,6 +2461,126 @@
       <w:r>
         <w:rPr/>
         <w:t xml:space="preserve"> for the pattern), and check it at &lt;640px width before calling it done. </w:t>
+      </w:r>
+    </w:p>
+    <w:p>
+      <w:pPr>
+        <w:pStyle w:val="BodyText"/>
+        <w:numPr>
+          <w:ilvl w:val="0"/>
+          <w:numId w:val="3"/>
+        </w:numPr>
+        <w:tabs>
+          <w:tab w:val="clear" w:pos="709"/>
+          <w:tab w:val="left" w:pos="869" w:leader="none"/>
+        </w:tabs>
+        <w:bidi w:val="0"/>
+        <w:ind w:hanging="283" w:left="869"/>
+        <w:jc w:val="left"/>
+        <w:rPr/>
+      </w:pPr>
+      <w:r>
+        <w:rPr>
+          <w:b/>
+        </w:rPr>
+        <w:t xml:space="preserve">Every list/table page uses the fixed-viewport </w:t>
+      </w:r>
+      <w:r>
+        <w:rPr>
+          <w:rStyle w:val="SourceText"/>
+          <w:b/>
+        </w:rPr>
+        <w:t>.page-fixed</w:t>
+      </w:r>
+      <w:r>
+        <w:rPr>
+          <w:b/>
+        </w:rPr>
+        <w:t xml:space="preserve"> layout</w:t>
+      </w:r>
+      <w:r>
+        <w:rPr/>
+        <w:t xml:space="preserve"> — the page itself never grows past the visible screen or produces its own page-level scrollbar, no matter how much data it holds. Add </w:t>
+      </w:r>
+      <w:r>
+        <w:rPr>
+          <w:rStyle w:val="SourceText"/>
+        </w:rPr>
+        <w:t>class="page-fixed"</w:t>
+      </w:r>
+      <w:r>
+        <w:rPr/>
+        <w:t xml:space="preserve"> to the page's root element, and wrap exactly one child (usually the table) in </w:t>
+      </w:r>
+      <w:r>
+        <w:rPr>
+          <w:rStyle w:val="SourceText"/>
+        </w:rPr>
+        <w:t>&lt;div class="page-scroll"&gt;</w:t>
+      </w:r>
+      <w:r>
+        <w:rPr/>
+        <w:t xml:space="preserve"> — everything else (heading, search/toolbar, pagination) stays fixed in place while only that wrapped part scrolls internally. See </w:t>
+      </w:r>
+      <w:r>
+        <w:rPr>
+          <w:rStyle w:val="SourceText"/>
+        </w:rPr>
+        <w:t>product-list.html</w:t>
+      </w:r>
+      <w:r>
+        <w:rPr/>
+        <w:t>/</w:t>
+      </w:r>
+      <w:r>
+        <w:rPr>
+          <w:rStyle w:val="SourceText"/>
+        </w:rPr>
+        <w:t>sale-history.html</w:t>
+      </w:r>
+      <w:r>
+        <w:rPr/>
+        <w:t xml:space="preserve"> for the pattern (defined once in </w:t>
+      </w:r>
+      <w:r>
+        <w:rPr>
+          <w:rStyle w:val="SourceText"/>
+        </w:rPr>
+        <w:t>styles.scss</w:t>
+      </w:r>
+      <w:r>
+        <w:rPr/>
+        <w:t>, relaxes to normal full-page scroll under 640px since a cramped internal scroll region doesn't feel natural on a phone). Checkout uses a bespoke variant of the same idea (</w:t>
+      </w:r>
+      <w:r>
+        <w:rPr>
+          <w:rStyle w:val="SourceText"/>
+        </w:rPr>
+        <w:t>checkout.scss</w:t>
+      </w:r>
+      <w:r>
+        <w:rPr/>
+        <w:t xml:space="preserve">) since it has two independently-scrolling panes instead of one (product grid, current-transaction cart) — same principle, applied twice, and deliberately </w:t>
+      </w:r>
+      <w:r>
+        <w:rPr>
+          <w:i/>
+        </w:rPr>
+        <w:t>not</w:t>
+      </w:r>
+      <w:r>
+        <w:rPr/>
+        <w:t xml:space="preserve"> relaxed on phones like </w:t>
+      </w:r>
+      <w:r>
+        <w:rPr>
+          <w:rStyle w:val="SourceText"/>
+        </w:rPr>
+        <w:t>.page-fixed</w:t>
+      </w:r>
+      <w:r>
+        <w:rPr/>
+        <w:t xml:space="preserve"> is, since the transaction panel needs to stay visible at all times regardless of screen size. </w:t>
       </w:r>
     </w:p>
     <w:p>

</xml_diff>